<commit_message>
Viết lại dàn ý theo nguyên tắc research paper writing, bỏ icon
- Bỏ toàn bộ emoji/icon, thay bằng nhãn văn bản ([Sẵn sàng]/[Một phần]/
  [Chưa có], 'Lưu ý n:')
- Áp dụng nguyên tắc một đoạn một thông điệp: câu đầu nêu rõ thông điệp
  của đoạn, các câu sau nối bằng quan hệ nhân quả hoặc tương phản
- Thêm mục A.3 Quy ước thuật ngữ để giữ thuật ngữ nhất quán toàn báo cáo
- Chuyển phần lớn gạch đầu dòng rời rạc thành văn xuôi mạch lạc hoặc
  bảng có tiêu đề rõ ràng; đánh số bảng theo chương
- Bổ sung thành viên thứ hai: Nguyễn Minh Khoa (24120073)

Co-Authored-By: Claude Opus 5 <noreply@anthropic.com>
</commit_message>
<xml_diff>
--- a/Doan/01-DeBai/yeu-cau-cua-thay.docx
+++ b/Doan/01-DeBai/yeu-cau-cua-thay.docx
@@ -1018,7 +1018,7 @@
                 <w:sz w:val="20"/>
                 <w:szCs w:val="20"/>
               </w:rPr>
-              <w:t xml:space="preserve">nguyên lý → phương pháp → giải thuật → CT minh họa</w:t>
+              <w:t xml:space="preserve">nguyên lý -&gt; phương pháp -&gt; giải thuật -&gt; CT minh họa</w:t>
             </w:r>
           </w:p>
         </w:tc>
@@ -1240,7 +1240,7 @@
         <w:pStyle w:val="Heading2"/>
       </w:pPr>
       <w:r>
-        <w:t xml:space="preserve">4. ⚠️ TÁM LỖI THƯỜNG GẶP CẦN TRÁNH (</w:t>
+        <w:t xml:space="preserve">4. TÁM LỖI THƯỜNG GẶP CẦN TRÁNH (</w:t>
       </w:r>
       <w:r>
         <w:rPr>
@@ -1266,19 +1266,10 @@
       </w:pPr>
       <w:r>
         <w:rPr>
-          <w:b/>
-          <w:bCs/>
           <w:sz w:val="21"/>
           <w:szCs w:val="21"/>
         </w:rPr>
-        <w:t xml:space="preserve">Đây là tài liệu quan trọng nhất.</w:t>
-      </w:r>
-      <w:r>
-        <w:rPr>
-          <w:sz w:val="21"/>
-          <w:szCs w:val="21"/>
-        </w:rPr>
-        <w:t xml:space="preserve"> Thầy liệt kê chính xác những lỗi sẽ bị trừ điểm. Mỗi mục gồm </w:t>
+        <w:t xml:space="preserve">Đây là tài liệu quan trọng nhất. Thầy liệt kê chính xác những lỗi sẽ bị trừ điểm. Mỗi mục gồm </w:t>
       </w:r>
       <w:r>
         <w:rPr>
@@ -1356,17 +1347,7 @@
         <w:spacing w:after="140"/>
       </w:pPr>
       <w:r>
-        <w:t xml:space="preserve">→ </w:t>
-      </w:r>
-      <w:r>
-        <w:rPr>
-          <w:i/>
-          <w:iCs/>
-        </w:rPr>
-        <w:t xml:space="preserve">Áp dụng:</w:t>
-      </w:r>
-      <w:r>
-        <w:t xml:space="preserve"> framework chỉ nêu "ước lượng tham số camera", KHÔNG được viết "dùng COLMAP". Chỉ nêu "biểu diễn cảnh", KHÔNG viết "dùng MLP".</w:t>
+        <w:t xml:space="preserve">-&gt; Áp dụng: framework chỉ nêu "ước lượng tham số camera", KHÔNG được viết "dùng COLMAP". Chỉ nêu "biểu diễn cảnh", KHÔNG viết "dùng MLP".</w:t>
       </w:r>
     </w:p>
     <w:p>
@@ -1430,17 +1411,7 @@
         <w:spacing w:after="140"/>
       </w:pPr>
       <w:r>
-        <w:t xml:space="preserve">→ </w:t>
-      </w:r>
-      <w:r>
-        <w:rPr>
-          <w:i/>
-          <w:iCs/>
-        </w:rPr>
-        <w:t xml:space="preserve">Áp dụng:</w:t>
-      </w:r>
-      <w:r>
-        <w:t xml:space="preserve"> mỗi công đoạn phải nêu rõ: </w:t>
+        <w:t xml:space="preserve">-&gt; Áp dụng: mỗi công đoạn phải nêu rõ: </w:t>
       </w:r>
       <w:r>
         <w:rPr>
@@ -1526,20 +1497,20 @@
         <w:spacing w:after="60"/>
       </w:pPr>
       <w:r>
-        <w:t xml:space="preserve">Mỗi giải pháp được trình bày với dàn bài khác nhau → rất khó so sánh giải pháp này với giải pháp khác</w:t>
-      </w:r>
-    </w:p>
-    <w:p>
-      <w:pPr>
-        <w:pStyle w:val="ListParagraph"/>
-        <w:numPr>
-          <w:ilvl w:val="0"/>
-          <w:numId w:val="2"/>
-        </w:numPr>
-        <w:spacing w:after="60"/>
-      </w:pPr>
-      <w:r>
-        <w:t xml:space="preserve">Không trình bày các giải pháp ứng với các công đoạn ở mục phát biểu bài toán → khó nhận biết các giải pháp đã đóng góp thế nào trong các công đoạn</w:t>
+        <w:t xml:space="preserve">Mỗi giải pháp được trình bày với dàn bài khác nhau -&gt; rất khó so sánh giải pháp này với giải pháp khác</w:t>
+      </w:r>
+    </w:p>
+    <w:p>
+      <w:pPr>
+        <w:pStyle w:val="ListParagraph"/>
+        <w:numPr>
+          <w:ilvl w:val="0"/>
+          <w:numId w:val="2"/>
+        </w:numPr>
+        <w:spacing w:after="60"/>
+      </w:pPr>
+      <w:r>
+        <w:t xml:space="preserve">Không trình bày các giải pháp ứng với các công đoạn ở mục phát biểu bài toán -&gt; khó nhận biết các giải pháp đã đóng góp thế nào trong các công đoạn</w:t>
       </w:r>
     </w:p>
     <w:p>
@@ -1547,17 +1518,7 @@
         <w:spacing w:after="140"/>
       </w:pPr>
       <w:r>
-        <w:t xml:space="preserve">→ </w:t>
-      </w:r>
-      <w:r>
-        <w:rPr>
-          <w:i/>
-          <w:iCs/>
-        </w:rPr>
-        <w:t xml:space="preserve">Áp dụng:</w:t>
-      </w:r>
-      <w:r>
-        <w:t xml:space="preserve"> bảng so sánh phải có </w:t>
+        <w:t xml:space="preserve">-&gt; Áp dụng: bảng so sánh phải có </w:t>
       </w:r>
       <w:r>
         <w:rPr>
@@ -1661,17 +1622,7 @@
         <w:spacing w:after="140"/>
       </w:pPr>
       <w:r>
-        <w:t xml:space="preserve">→ </w:t>
-      </w:r>
-      <w:r>
-        <w:rPr>
-          <w:i/>
-          <w:iCs/>
-        </w:rPr>
-        <w:t xml:space="preserve">Áp dụng:</w:t>
-      </w:r>
-      <w:r>
-        <w:t xml:space="preserve"> phải nói rõ với NeRF thì ground truth chính là </w:t>
+        <w:t xml:space="preserve">-&gt; Áp dụng: phải nói rõ với NeRF thì ground truth chính là </w:t>
       </w:r>
       <w:r>
         <w:rPr>
@@ -1755,17 +1706,7 @@
         <w:spacing w:after="140"/>
       </w:pPr>
       <w:r>
-        <w:t xml:space="preserve">→ </w:t>
-      </w:r>
-      <w:r>
-        <w:rPr>
-          <w:i/>
-          <w:iCs/>
-        </w:rPr>
-        <w:t xml:space="preserve">Áp dụng:</w:t>
-      </w:r>
-      <w:r>
-        <w:t xml:space="preserve"> tách rõ </w:t>
+        <w:t xml:space="preserve">-&gt; Áp dụng: tách rõ </w:t>
       </w:r>
       <w:r>
         <w:rPr>
@@ -1871,7 +1812,7 @@
         <w:t xml:space="preserve">Không hiểu loss function có liên quan gì đến độ đo đánh giá</w:t>
       </w:r>
       <w:r>
-        <w:t xml:space="preserve"> → có thể dẫn đến tình trạng </w:t>
+        <w:t xml:space="preserve"> -&gt; có thể dẫn đến tình trạng </w:t>
       </w:r>
       <w:r>
         <w:rPr>
@@ -1886,17 +1827,7 @@
         <w:spacing w:after="140"/>
       </w:pPr>
       <w:r>
-        <w:t xml:space="preserve">→ </w:t>
-      </w:r>
-      <w:r>
-        <w:rPr>
-          <w:i/>
-          <w:iCs/>
-        </w:rPr>
-        <w:t xml:space="preserve">Áp dụng:</w:t>
-      </w:r>
-      <w:r>
-        <w:t xml:space="preserve"> phải phân tích mối liên hệ giữa loss (MSE) và độ đo (PSNR có quan hệ trực tiếp với MSE; SSIM/LPIPS thì KHÔNG được tối ưu trực tiếp). Phải nêu độ phức tạp tính toán: số phép truy vấn mạng/tia, thời gian train, thời gian render, bộ nhớ.</w:t>
+        <w:t xml:space="preserve">-&gt; Áp dụng: phải phân tích mối liên hệ giữa loss (MSE) và độ đo (PSNR có quan hệ trực tiếp với MSE; SSIM/LPIPS thì KHÔNG được tối ưu trực tiếp). Phải nêu độ phức tạp tính toán: số phép truy vấn mạng/tia, thời gian train, thời gian render, bộ nhớ.</w:t>
       </w:r>
     </w:p>
     <w:p>
@@ -2040,17 +1971,7 @@
         <w:spacing w:after="140"/>
       </w:pPr>
       <w:r>
-        <w:t xml:space="preserve">→ </w:t>
-      </w:r>
-      <w:r>
-        <w:rPr>
-          <w:i/>
-          <w:iCs/>
-        </w:rPr>
-        <w:t xml:space="preserve">Áp dụng:</w:t>
-      </w:r>
-      <w:r>
-        <w:t xml:space="preserve"> với mỗi dataset phải nêu rõ nó chứa thách thức gì (cảnh unbounded, vật thể mảnh, bề mặt phản chiếu, ánh sáng thay đổi, vùng ít ảnh quan sát...).</w:t>
+        <w:t xml:space="preserve">-&gt; Áp dụng: với mỗi dataset phải nêu rõ nó chứa thách thức gì (cảnh unbounded, vật thể mảnh, bề mặt phản chiếu, ánh sáng thay đổi, vùng ít ảnh quan sát...).</w:t>
       </w:r>
     </w:p>
     <w:p>
@@ -2154,17 +2075,7 @@
         <w:spacing w:after="140"/>
       </w:pPr>
       <w:r>
-        <w:t xml:space="preserve">→ </w:t>
-      </w:r>
-      <w:r>
-        <w:rPr>
-          <w:i/>
-          <w:iCs/>
-        </w:rPr>
-        <w:t xml:space="preserve">Áp dụng:</w:t>
-      </w:r>
-      <w:r>
-        <w:t xml:space="preserve"> cuối Chương 2 phải có bảng: mỗi công đoạn còn khuyết điểm gì, thuộc loại </w:t>
+        <w:t xml:space="preserve">-&gt; Áp dụng: cuối Chương 2 phải có bảng: mỗi công đoạn còn khuyết điểm gì, thuộc loại </w:t>
       </w:r>
       <w:r>
         <w:rPr>
@@ -2228,7 +2139,7 @@
           <w:b/>
           <w:bCs/>
         </w:rPr>
-        <w:t xml:space="preserve">LƯU Ý 1</w:t>
+        <w:t xml:space="preserve">Lưu ý 1</w:t>
       </w:r>
       <w:r>
         <w:t xml:space="preserve"> — Framework ở mục 1.3 chỉ nêu công đoạn tổng quát, không nhắc tên phương pháp cụ thể</w:t>
@@ -2251,7 +2162,7 @@
           <w:b/>
           <w:bCs/>
         </w:rPr>
-        <w:t xml:space="preserve">LƯU Ý 2</w:t>
+        <w:t xml:space="preserve">Lưu ý 2</w:t>
       </w:r>
       <w:r>
         <w:t xml:space="preserve"> — Mỗi công đoạn có nêu rõ: đã cho gì, ẩn số cần tìm là gì</w:t>
@@ -2274,7 +2185,7 @@
           <w:b/>
           <w:bCs/>
         </w:rPr>
-        <w:t xml:space="preserve">LƯU Ý 3</w:t>
+        <w:t xml:space="preserve">Lưu ý 3</w:t>
       </w:r>
       <w:r>
         <w:t xml:space="preserve"> — Bảng so sánh ở Chương 2 có cột ứng với các công đoạn; mọi phương pháp mô tả theo cùng một khuôn</w:t>
@@ -2297,7 +2208,7 @@
           <w:b/>
           <w:bCs/>
         </w:rPr>
-        <w:t xml:space="preserve">LƯU Ý 4</w:t>
+        <w:t xml:space="preserve">Lưu ý 4</w:t>
       </w:r>
       <w:r>
         <w:t xml:space="preserve"> — Có nêu rõ ground truth là gì, cách "đánh nhãn", loss function</w:t>
@@ -2320,7 +2231,7 @@
           <w:b/>
           <w:bCs/>
         </w:rPr>
-        <w:t xml:space="preserve">LƯU Ý 5</w:t>
+        <w:t xml:space="preserve">Lưu ý 5</w:t>
       </w:r>
       <w:r>
         <w:t xml:space="preserve"> — Có 2 sơ đồ riêng cho giai đoạn học và giai đoạn kiểm thử</w:t>
@@ -2343,7 +2254,7 @@
           <w:b/>
           <w:bCs/>
         </w:rPr>
-        <w:t xml:space="preserve">LƯU Ý 6</w:t>
+        <w:t xml:space="preserve">Lưu ý 6</w:t>
       </w:r>
       <w:r>
         <w:t xml:space="preserve"> — Có cả độ đo chính xác lẫn độ phức tạp tính toán; có phân tích quan hệ loss ↔ độ đo</w:t>
@@ -2366,7 +2277,7 @@
           <w:b/>
           <w:bCs/>
         </w:rPr>
-        <w:t xml:space="preserve">LƯU Ý 7</w:t>
+        <w:t xml:space="preserve">Lưu ý 7</w:t>
       </w:r>
       <w:r>
         <w:t xml:space="preserve"> — Mô tả dataset có nêu thách thức, số mẫu, tính đa dạng, tiêu chí xây dựng</w:t>
@@ -2389,7 +2300,7 @@
           <w:b/>
           <w:bCs/>
         </w:rPr>
-        <w:t xml:space="preserve">LƯU Ý 8</w:t>
+        <w:t xml:space="preserve">Lưu ý 8</w:t>
       </w:r>
       <w:r>
         <w:t xml:space="preserve"> — Cuối Chương 2 có bảng khuyết điểm tồn đọng theo từng công đoạn, phân loại độ chính xác / độ phức tạp</w:t>
@@ -2415,7 +2326,7 @@
         <w:t xml:space="preserve">phuongphap.rtf 2.6</w:t>
       </w:r>
       <w:r>
-        <w:t xml:space="preserve"> — Chương 3 trình bày theo mạch: nguyên lý → phương pháp → giải thuật → CT minh họa</w:t>
+        <w:t xml:space="preserve"> — Chương 3 trình bày theo mạch: nguyên lý -&gt; phương pháp -&gt; giải thuật -&gt; CT minh họa</w:t>
       </w:r>
     </w:p>
     <w:p>

</xml_diff>

<commit_message>
Rà soát văn phong bằng skill humanizer
Bỏ các dấu hiệu văn AI trong 4 tài liệu tiếng Việt:
- Bỏ toàn bộ 54 dấu gạch ngang dài, thay bằng dấu phẩy, hai chấm hoặc
  tách câu tùy quan hệ giữa hai vế
- Bỏ cấu trúc 'không chỉ X mà Y' (nêu thẳng yêu cầu)
- Bỏ ngôn ngữ thổi phồng: cốt lõi, then chốt, quan trọng nhất,
  có giá trị cao, thay bằng cách nêu thẳng lý do
- Bỏ câu mô tả thừa về cấu trúc tài liệu khi người đọc đã thấy được
- Gộp câu đứng một mình chỉ để nhấn mạnh vào nội dung xung quanh

Giữ nguyên: hai danh sách ba mục ở Chương 2 và 4 (ba ý thật sự khác
nhau), phần mô tả cấu trúc chương (là nội dung chính của một dàn ý),
bảng biểu, khối mã, đường dẫn file.

Co-Authored-By: Claude Opus 5 <noreply@anthropic.com>
</commit_message>
<xml_diff>
--- a/Doan/01-DeBai/yeu-cau-cua-thay.docx
+++ b/Doan/01-DeBai/yeu-cau-cua-thay.docx
@@ -302,7 +302,7 @@
         <w:t xml:space="preserve">1.4.</w:t>
       </w:r>
       <w:r>
-        <w:t xml:space="preserve"> Đóng góp — Báo cáo được khảo sát nhằm đóng góp nội dung gì</w:t>
+        <w:t xml:space="preserve"> Đóng góp, Báo cáo được khảo sát nhằm đóng góp nội dung gì</w:t>
       </w:r>
     </w:p>
     <w:p>
@@ -786,7 +786,7 @@
                 <w:sz w:val="20"/>
                 <w:szCs w:val="20"/>
               </w:rPr>
-              <w:t xml:space="preserve">Tích cực tìm kiếm tài liệu &amp; đọc hiểu — ưu tiên hội nghị/tạp chí uy tín (CVPR, ICCV, IJCV...), luận văn Th.S, luận án TS. Dùng từ khóa </w:t>
+              <w:t xml:space="preserve">Tích cực tìm kiếm tài liệu &amp; đọc hiểu, ưu tiên hội nghị/tạp chí uy tín (CVPR, ICCV, IJCV...), luận văn Th.S, luận án TS. Dùng từ khóa </w:t>
             </w:r>
             <w:r>
               <w:rPr>
@@ -933,14 +933,14 @@
                 <w:sz w:val="20"/>
                 <w:szCs w:val="20"/>
               </w:rPr>
-              <w:t xml:space="preserve">Khảo sát tổng quan</w:t>
+              <w:t xml:space="preserve">Khảo sát tổng quan:</w:t>
             </w:r>
             <w:r>
               <w:rPr>
                 <w:sz w:val="20"/>
                 <w:szCs w:val="20"/>
               </w:rPr>
-              <w:t xml:space="preserve"> — trả lời 2 câu hỏi: Người ta đã làm gì rồi? Đồ án muốn làm gì tiếp?</w:t>
+              <w:t xml:space="preserve"> trả lời 2 câu hỏi: Người ta đã làm gì rồi? Đồ án muốn làm gì tiếp?</w:t>
             </w:r>
           </w:p>
         </w:tc>
@@ -1309,7 +1309,7 @@
         <w:pStyle w:val="Heading3"/>
       </w:pPr>
       <w:r>
-        <w:t xml:space="preserve">Lưu ý 1 — Framework chung phải tổng quát</w:t>
+        <w:t xml:space="preserve">Lưu ý 1. Framework chung phải tổng quát</w:t>
       </w:r>
     </w:p>
     <w:p>
@@ -1363,7 +1363,7 @@
         <w:pStyle w:val="Heading3"/>
       </w:pPr>
       <w:r>
-        <w:t xml:space="preserve">Lưu ý 2 — Phải xác định ẩn số trong từng công đoạn</w:t>
+        <w:t xml:space="preserve">Lưu ý 2. Phải xác định ẩn số trong từng công đoạn</w:t>
       </w:r>
     </w:p>
     <w:p>
@@ -1447,7 +1447,7 @@
         <w:pStyle w:val="Heading3"/>
       </w:pPr>
       <w:r>
-        <w:t xml:space="preserve">Lưu ý 3 — Related works so sánh theo CÙNG cột tiêu chí, ỨNG VỚI các công đoạn</w:t>
+        <w:t xml:space="preserve">Lưu ý 3. Related works so sánh theo CÙNG cột tiêu chí, ỨNG VỚI các công đoạn</w:t>
       </w:r>
     </w:p>
     <w:p>
@@ -1554,7 +1554,7 @@
         <w:pStyle w:val="Heading3"/>
       </w:pPr>
       <w:r>
-        <w:t xml:space="preserve">Lưu ý 4 — Giai đoạn học: ground truth, đánh nhãn, loss function</w:t>
+        <w:t xml:space="preserve">Lưu ý 4. Giai đoạn học: ground truth, đánh nhãn, loss function</w:t>
       </w:r>
     </w:p>
     <w:p>
@@ -1629,10 +1629,10 @@
           <w:b/>
           <w:bCs/>
         </w:rPr>
-        <w:t xml:space="preserve">màu pixel của ảnh đã chụp</w:t>
-      </w:r>
-      <w:r>
-        <w:t xml:space="preserve"> — tức dữ liệu </w:t>
+        <w:t xml:space="preserve">màu pixel của ảnh đã chụp:</w:t>
+      </w:r>
+      <w:r>
+        <w:t xml:space="preserve"> tức dữ liệu </w:t>
       </w:r>
       <w:r>
         <w:rPr>
@@ -1658,7 +1658,7 @@
         <w:pStyle w:val="Heading3"/>
       </w:pPr>
       <w:r>
-        <w:t xml:space="preserve">Lưu ý 5 — Trình bày rõ tiến trình giai đoạn học VÀ giai đoạn kiểm thử</w:t>
+        <w:t xml:space="preserve">Lưu ý 5. Trình bày rõ tiến trình giai đoạn học VÀ giai đoạn kiểm thử</w:t>
       </w:r>
     </w:p>
     <w:p>
@@ -1732,7 +1732,7 @@
         <w:pStyle w:val="Heading3"/>
       </w:pPr>
       <w:r>
-        <w:t xml:space="preserve">Lưu ý 6 — Độ đo phải có CẢ độ chính xác LẪN độ phức tạp tính toán</w:t>
+        <w:t xml:space="preserve">Lưu ý 6. Độ đo phải có CẢ độ chính xác LẪN độ phức tạp tính toán</w:t>
       </w:r>
     </w:p>
     <w:p>
@@ -1843,7 +1843,7 @@
         <w:pStyle w:val="Heading3"/>
       </w:pPr>
       <w:r>
-        <w:t xml:space="preserve">Lưu ý 7 — Mô tả tập dữ liệu phải nêu được THÁCH THỨC</w:t>
+        <w:t xml:space="preserve">Lưu ý 7. Mô tả tập dữ liệu phải nêu được THÁCH THỨC</w:t>
       </w:r>
     </w:p>
     <w:p>
@@ -1987,7 +1987,7 @@
         <w:pStyle w:val="Heading3"/>
       </w:pPr>
       <w:r>
-        <w:t xml:space="preserve">Lưu ý 8 — Related works phải chỉ ra khuyết điểm tồn đọng THEO CÔNG ĐOẠN</w:t>
+        <w:t xml:space="preserve">Lưu ý 8. Related works phải chỉ ra khuyết điểm tồn đọng THEO CÔNG ĐOẠN</w:t>
       </w:r>
     </w:p>
     <w:p>
@@ -2139,10 +2139,10 @@
           <w:b/>
           <w:bCs/>
         </w:rPr>
-        <w:t xml:space="preserve">Lưu ý 1</w:t>
-      </w:r>
-      <w:r>
-        <w:t xml:space="preserve"> — Framework ở mục 1.3 chỉ nêu công đoạn tổng quát, không nhắc tên phương pháp cụ thể</w:t>
+        <w:t xml:space="preserve">Lưu ý 1:</w:t>
+      </w:r>
+      <w:r>
+        <w:t xml:space="preserve"> Framework ở mục 1.3 chỉ nêu công đoạn tổng quát, không nhắc tên phương pháp cụ thể</w:t>
       </w:r>
     </w:p>
     <w:p>
@@ -2162,10 +2162,10 @@
           <w:b/>
           <w:bCs/>
         </w:rPr>
-        <w:t xml:space="preserve">Lưu ý 2</w:t>
-      </w:r>
-      <w:r>
-        <w:t xml:space="preserve"> — Mỗi công đoạn có nêu rõ: đã cho gì, ẩn số cần tìm là gì</w:t>
+        <w:t xml:space="preserve">Lưu ý 2:</w:t>
+      </w:r>
+      <w:r>
+        <w:t xml:space="preserve"> Mỗi công đoạn có nêu rõ: đã cho gì, ẩn số cần tìm là gì</w:t>
       </w:r>
     </w:p>
     <w:p>
@@ -2185,10 +2185,10 @@
           <w:b/>
           <w:bCs/>
         </w:rPr>
-        <w:t xml:space="preserve">Lưu ý 3</w:t>
-      </w:r>
-      <w:r>
-        <w:t xml:space="preserve"> — Bảng so sánh ở Chương 2 có cột ứng với các công đoạn; mọi phương pháp mô tả theo cùng một khuôn</w:t>
+        <w:t xml:space="preserve">Lưu ý 3:</w:t>
+      </w:r>
+      <w:r>
+        <w:t xml:space="preserve"> Bảng so sánh ở Chương 2 có cột ứng với các công đoạn; mọi phương pháp mô tả theo cùng một khuôn</w:t>
       </w:r>
     </w:p>
     <w:p>
@@ -2208,10 +2208,10 @@
           <w:b/>
           <w:bCs/>
         </w:rPr>
-        <w:t xml:space="preserve">Lưu ý 4</w:t>
-      </w:r>
-      <w:r>
-        <w:t xml:space="preserve"> — Có nêu rõ ground truth là gì, cách "đánh nhãn", loss function</w:t>
+        <w:t xml:space="preserve">Lưu ý 4:</w:t>
+      </w:r>
+      <w:r>
+        <w:t xml:space="preserve"> Có nêu rõ ground truth là gì, cách "đánh nhãn", loss function</w:t>
       </w:r>
     </w:p>
     <w:p>
@@ -2231,10 +2231,10 @@
           <w:b/>
           <w:bCs/>
         </w:rPr>
-        <w:t xml:space="preserve">Lưu ý 5</w:t>
-      </w:r>
-      <w:r>
-        <w:t xml:space="preserve"> — Có 2 sơ đồ riêng cho giai đoạn học và giai đoạn kiểm thử</w:t>
+        <w:t xml:space="preserve">Lưu ý 5:</w:t>
+      </w:r>
+      <w:r>
+        <w:t xml:space="preserve"> Có 2 sơ đồ riêng cho giai đoạn học và giai đoạn kiểm thử</w:t>
       </w:r>
     </w:p>
     <w:p>
@@ -2254,10 +2254,10 @@
           <w:b/>
           <w:bCs/>
         </w:rPr>
-        <w:t xml:space="preserve">Lưu ý 6</w:t>
-      </w:r>
-      <w:r>
-        <w:t xml:space="preserve"> — Có cả độ đo chính xác lẫn độ phức tạp tính toán; có phân tích quan hệ loss ↔ độ đo</w:t>
+        <w:t xml:space="preserve">Lưu ý 6:</w:t>
+      </w:r>
+      <w:r>
+        <w:t xml:space="preserve"> Có cả độ đo chính xác lẫn độ phức tạp tính toán; có phân tích quan hệ loss ↔ độ đo</w:t>
       </w:r>
     </w:p>
     <w:p>
@@ -2277,10 +2277,10 @@
           <w:b/>
           <w:bCs/>
         </w:rPr>
-        <w:t xml:space="preserve">Lưu ý 7</w:t>
-      </w:r>
-      <w:r>
-        <w:t xml:space="preserve"> — Mô tả dataset có nêu thách thức, số mẫu, tính đa dạng, tiêu chí xây dựng</w:t>
+        <w:t xml:space="preserve">Lưu ý 7:</w:t>
+      </w:r>
+      <w:r>
+        <w:t xml:space="preserve"> Mô tả dataset có nêu thách thức, số mẫu, tính đa dạng, tiêu chí xây dựng</w:t>
       </w:r>
     </w:p>
     <w:p>
@@ -2300,10 +2300,10 @@
           <w:b/>
           <w:bCs/>
         </w:rPr>
-        <w:t xml:space="preserve">Lưu ý 8</w:t>
-      </w:r>
-      <w:r>
-        <w:t xml:space="preserve"> — Cuối Chương 2 có bảng khuyết điểm tồn đọng theo từng công đoạn, phân loại độ chính xác / độ phức tạp</w:t>
+        <w:t xml:space="preserve">Lưu ý 8:</w:t>
+      </w:r>
+      <w:r>
+        <w:t xml:space="preserve"> Cuối Chương 2 có bảng khuyết điểm tồn đọng theo từng công đoạn, phân loại độ chính xác / độ phức tạp</w:t>
       </w:r>
     </w:p>
     <w:p>
@@ -2323,10 +2323,10 @@
           <w:b/>
           <w:bCs/>
         </w:rPr>
-        <w:t xml:space="preserve">phuongphap.rtf 2.6</w:t>
-      </w:r>
-      <w:r>
-        <w:t xml:space="preserve"> — Chương 3 trình bày theo mạch: nguyên lý -&gt; phương pháp -&gt; giải thuật -&gt; CT minh họa</w:t>
+        <w:t xml:space="preserve">phuongphap.rtf 2.6:</w:t>
+      </w:r>
+      <w:r>
+        <w:t xml:space="preserve"> Chương 3 trình bày theo mạch: nguyên lý -&gt; phương pháp -&gt; giải thuật -&gt; CT minh họa</w:t>
       </w:r>
     </w:p>
     <w:p>
@@ -2346,10 +2346,10 @@
           <w:b/>
           <w:bCs/>
         </w:rPr>
-        <w:t xml:space="preserve">phuongphap.rtf 2.7</w:t>
-      </w:r>
-      <w:r>
-        <w:t xml:space="preserve"> — Chương 4 có đủ: môi trường (phần cứng + phần mềm), dataset, bảng kết quả, đánh giá</w:t>
+        <w:t xml:space="preserve">phuongphap.rtf 2.7:</w:t>
+      </w:r>
+      <w:r>
+        <w:t xml:space="preserve"> Chương 4 có đủ: môi trường (phần cứng + phần mềm), dataset, bảng kết quả, đánh giá</w:t>
       </w:r>
     </w:p>
     <w:p>
@@ -2369,10 +2369,10 @@
           <w:b/>
           <w:bCs/>
         </w:rPr>
-        <w:t xml:space="preserve">phuongphap.rtf 2.9</w:t>
-      </w:r>
-      <w:r>
-        <w:t xml:space="preserve"> — Có bảng phân công theo mốc thời gian</w:t>
+        <w:t xml:space="preserve">phuongphap.rtf 2.9:</w:t>
+      </w:r>
+      <w:r>
+        <w:t xml:space="preserve"> Có bảng phân công theo mốc thời gian</w:t>
       </w:r>
     </w:p>
     <w:p>
@@ -2392,10 +2392,10 @@
           <w:b/>
           <w:bCs/>
         </w:rPr>
-        <w:t xml:space="preserve">huongdantrinhbay</w:t>
-      </w:r>
-      <w:r>
-        <w:t xml:space="preserve"> — Chương 4 có cả code tận dụng sẵn </w:t>
+        <w:t xml:space="preserve">huongdantrinhbay:</w:t>
+      </w:r>
+      <w:r>
+        <w:t xml:space="preserve"> Chương 4 có cả code tận dụng sẵn </w:t>
       </w:r>
       <w:r>
         <w:rPr>
@@ -2422,10 +2422,10 @@
           <w:b/>
           <w:bCs/>
         </w:rPr>
-        <w:t xml:space="preserve">Phạm vi</w:t>
-      </w:r>
-      <w:r>
-        <w:t xml:space="preserve"> — Không tuyên bố "đề xuất phương pháp mới" (thầy ghi rõ chưa yêu cầu)</w:t>
+        <w:t xml:space="preserve">Phạm vi:</w:t>
+      </w:r>
+      <w:r>
+        <w:t xml:space="preserve"> Không tuyên bố "đề xuất phương pháp mới" (thầy ghi rõ chưa yêu cầu)</w:t>
       </w:r>
     </w:p>
     <w:sectPr>

</xml_diff>

<commit_message>
Siết chặt quy trình chuyển md sang docx, không để mất nội dung
Sửa 2 lỗi thật của bộ chuyển đổi:
- Thẻ <br> bị in thành chữ trong file Word
- Chú thích <!-- --> bị in thành chữ trong file Word

Bổ sung cho bộ chuyển đổi:
- Liên kết [text](url) thành hyperlink thật
- Ảnh ![alt](path) nhúng vào file, cảnh báo nếu không tìm thấy
- Danh sách lồng nhau 2 cấp
- In đậm lồng trong các định dạng khác
- Cảnh báo khi còn thẻ HTML chưa xử lý

Thêm kiem-tra-chuyen-doi.py: đối chiếu từng dòng nội dung giữa .md và
.docx, kiểm tra số bảng, số hình, thẻ HTML lọt ra, và dấu hiệu văn AI.
Đã thử trên file mẫu đủ loại cú pháp và thử phá hoại có chủ đích để xác
nhận script bắt được lỗi thật.

Dọn file nguồn: bỏ <br>, đổi 8 mũi tên -> thành nhãn **Áp dụng:**

Co-Authored-By: Claude Opus 5 <noreply@anthropic.com>
</commit_message>
<xml_diff>
--- a/Doan/01-DeBai/yeu-cau-cua-thay.docx
+++ b/Doan/01-DeBai/yeu-cau-cua-thay.docx
@@ -253,7 +253,7 @@
       <w:pPr>
         <w:pStyle w:val="ListParagraph"/>
         <w:numPr>
-          <w:ilvl w:val="0"/>
+          <w:ilvl w:val="1"/>
           <w:numId w:val="2"/>
         </w:numPr>
         <w:spacing w:after="60"/>
@@ -266,7 +266,7 @@
       <w:pPr>
         <w:pStyle w:val="ListParagraph"/>
         <w:numPr>
-          <w:ilvl w:val="0"/>
+          <w:ilvl w:val="1"/>
           <w:numId w:val="2"/>
         </w:numPr>
         <w:spacing w:after="60"/>
@@ -1347,7 +1347,14 @@
         <w:spacing w:after="140"/>
       </w:pPr>
       <w:r>
-        <w:t xml:space="preserve">-&gt; Áp dụng: framework chỉ nêu "ước lượng tham số camera", KHÔNG được viết "dùng COLMAP". Chỉ nêu "biểu diễn cảnh", KHÔNG viết "dùng MLP".</w:t>
+        <w:rPr>
+          <w:b/>
+          <w:bCs/>
+        </w:rPr>
+        <w:t xml:space="preserve">Áp dụng:</w:t>
+      </w:r>
+      <w:r>
+        <w:t xml:space="preserve"> framework chỉ nêu "ước lượng tham số camera", KHÔNG được viết "dùng COLMAP". Chỉ nêu "biểu diễn cảnh", KHÔNG viết "dùng MLP".</w:t>
       </w:r>
     </w:p>
     <w:p>
@@ -1411,7 +1418,14 @@
         <w:spacing w:after="140"/>
       </w:pPr>
       <w:r>
-        <w:t xml:space="preserve">-&gt; Áp dụng: mỗi công đoạn phải nêu rõ: </w:t>
+        <w:rPr>
+          <w:b/>
+          <w:bCs/>
+        </w:rPr>
+        <w:t xml:space="preserve">Áp dụng:</w:t>
+      </w:r>
+      <w:r>
+        <w:t xml:space="preserve"> mỗi công đoạn phải nêu rõ: </w:t>
       </w:r>
       <w:r>
         <w:rPr>
@@ -1518,7 +1532,14 @@
         <w:spacing w:after="140"/>
       </w:pPr>
       <w:r>
-        <w:t xml:space="preserve">-&gt; Áp dụng: bảng so sánh phải có </w:t>
+        <w:rPr>
+          <w:b/>
+          <w:bCs/>
+        </w:rPr>
+        <w:t xml:space="preserve">Áp dụng:</w:t>
+      </w:r>
+      <w:r>
+        <w:t xml:space="preserve"> bảng so sánh phải có </w:t>
       </w:r>
       <w:r>
         <w:rPr>
@@ -1622,7 +1643,14 @@
         <w:spacing w:after="140"/>
       </w:pPr>
       <w:r>
-        <w:t xml:space="preserve">-&gt; Áp dụng: phải nói rõ với NeRF thì ground truth chính là </w:t>
+        <w:rPr>
+          <w:b/>
+          <w:bCs/>
+        </w:rPr>
+        <w:t xml:space="preserve">Áp dụng:</w:t>
+      </w:r>
+      <w:r>
+        <w:t xml:space="preserve"> phải nói rõ với NeRF thì ground truth chính là </w:t>
       </w:r>
       <w:r>
         <w:rPr>
@@ -1706,7 +1734,14 @@
         <w:spacing w:after="140"/>
       </w:pPr>
       <w:r>
-        <w:t xml:space="preserve">-&gt; Áp dụng: tách rõ </w:t>
+        <w:rPr>
+          <w:b/>
+          <w:bCs/>
+        </w:rPr>
+        <w:t xml:space="preserve">Áp dụng:</w:t>
+      </w:r>
+      <w:r>
+        <w:t xml:space="preserve"> tách rõ </w:t>
       </w:r>
       <w:r>
         <w:rPr>
@@ -1827,7 +1862,14 @@
         <w:spacing w:after="140"/>
       </w:pPr>
       <w:r>
-        <w:t xml:space="preserve">-&gt; Áp dụng: phải phân tích mối liên hệ giữa loss (MSE) và độ đo (PSNR có quan hệ trực tiếp với MSE; SSIM/LPIPS thì KHÔNG được tối ưu trực tiếp). Phải nêu độ phức tạp tính toán: số phép truy vấn mạng/tia, thời gian train, thời gian render, bộ nhớ.</w:t>
+        <w:rPr>
+          <w:b/>
+          <w:bCs/>
+        </w:rPr>
+        <w:t xml:space="preserve">Áp dụng:</w:t>
+      </w:r>
+      <w:r>
+        <w:t xml:space="preserve"> phải phân tích mối liên hệ giữa loss (MSE) và độ đo (PSNR có quan hệ trực tiếp với MSE; SSIM/LPIPS thì KHÔNG được tối ưu trực tiếp). Phải nêu độ phức tạp tính toán: số phép truy vấn mạng/tia, thời gian train, thời gian render, bộ nhớ.</w:t>
       </w:r>
     </w:p>
     <w:p>
@@ -1971,7 +2013,14 @@
         <w:spacing w:after="140"/>
       </w:pPr>
       <w:r>
-        <w:t xml:space="preserve">-&gt; Áp dụng: với mỗi dataset phải nêu rõ nó chứa thách thức gì (cảnh unbounded, vật thể mảnh, bề mặt phản chiếu, ánh sáng thay đổi, vùng ít ảnh quan sát...).</w:t>
+        <w:rPr>
+          <w:b/>
+          <w:bCs/>
+        </w:rPr>
+        <w:t xml:space="preserve">Áp dụng:</w:t>
+      </w:r>
+      <w:r>
+        <w:t xml:space="preserve"> với mỗi dataset phải nêu rõ nó chứa thách thức gì (cảnh unbounded, vật thể mảnh, bề mặt phản chiếu, ánh sáng thay đổi, vùng ít ảnh quan sát...).</w:t>
       </w:r>
     </w:p>
     <w:p>
@@ -2075,7 +2124,14 @@
         <w:spacing w:after="140"/>
       </w:pPr>
       <w:r>
-        <w:t xml:space="preserve">-&gt; Áp dụng: cuối Chương 2 phải có bảng: mỗi công đoạn còn khuyết điểm gì, thuộc loại </w:t>
+        <w:rPr>
+          <w:b/>
+          <w:bCs/>
+        </w:rPr>
+        <w:t xml:space="preserve">Áp dụng:</w:t>
+      </w:r>
+      <w:r>
+        <w:t xml:space="preserve"> cuối Chương 2 phải có bảng: mỗi công đoạn còn khuyết điểm gì, thuộc loại </w:t>
       </w:r>
       <w:r>
         <w:rPr>
@@ -2609,6 +2665,15 @@
         <w:ind w:left="540" w:hanging="270"/>
       </w:pPr>
     </w:lvl>
+    <w:lvl w:ilvl="1" w:tentative="1">
+      <w:start w:val="1"/>
+      <w:numFmt w:val="bullet"/>
+      <w:lvlText w:val="◦"/>
+      <w:lvlJc w:val="left"/>
+      <w:pPr>
+        <w:ind w:left="1080" w:hanging="270"/>
+      </w:pPr>
+    </w:lvl>
   </w:abstractNum>
   <w:abstractNum w:abstractNumId="3" w15:restartNumberingAfterBreak="0">
     <w:multiLevelType w:val="hybridMultilevel"/>
@@ -2619,6 +2684,15 @@
       <w:lvlJc w:val="left"/>
       <w:pPr>
         <w:ind w:left="540" w:hanging="270"/>
+      </w:pPr>
+    </w:lvl>
+    <w:lvl w:ilvl="1" w:tentative="1">
+      <w:start w:val="1"/>
+      <w:numFmt w:val="lowerLetter"/>
+      <w:lvlText w:val="%2."/>
+      <w:lvlJc w:val="left"/>
+      <w:pPr>
+        <w:ind w:left="1080" w:hanging="270"/>
       </w:pPr>
     </w:lvl>
   </w:abstractNum>

</xml_diff>